<commit_message>
Replace report screenshots with actual, clean dashboard visuals (no errors)
</commit_message>
<xml_diff>
--- a/report/Project_Report.docx
+++ b/report/Project_Report.docx
@@ -244,7 +244,7 @@
         <w:spacing w:before="240" w:after="120"/>
       </w:pPr>
       <w:r>
-        <w:t>2. Interactive Web Dashboard Interface</w:t>
+        <w:t>2. Interactive Web Dashboard Interface (Screenshots)</w:t>
       </w:r>
     </w:p>
     <w:p>
@@ -258,7 +258,7 @@
           <w:i w:val="0"/>
           <w:sz w:val="22"/>
         </w:rPr>
-        <w:t>To display real-time interactive dashboards to business managers, we developed a PHP Laravel 9 web application connected to a MySQL database, presenting 17 dynamic interactive charts. Below are the interface screenshots representing the primary administrative views of the developed platform:</w:t>
+        <w:t>To display real-time interactive dashboards to business managers, we developed a PHP Laravel 9 web application connected to a MySQL database, presenting 17 dynamic interactive charts. Below are the clean, error-free interface screenshots representing the primary administrative views of the developed platform:</w:t>
       </w:r>
     </w:p>
     <w:p>
@@ -371,7 +371,7 @@
       <w:r>
         <w:drawing>
           <wp:inline xmlns:a="http://schemas.openxmlformats.org/drawingml/2006/main" xmlns:pic="http://schemas.openxmlformats.org/drawingml/2006/picture">
-            <wp:extent cx="5486400" cy="2968228"/>
+            <wp:extent cx="5486400" cy="6386512"/>
             <wp:docPr id="2" name="Picture 2"/>
             <wp:cNvGraphicFramePr>
               <a:graphicFrameLocks noChangeAspect="1"/>
@@ -392,7 +392,7 @@
                   <pic:spPr>
                     <a:xfrm>
                       <a:off x="0" y="0"/>
-                      <a:ext cx="5486400" cy="2968228"/>
+                      <a:ext cx="5486400" cy="6386512"/>
                     </a:xfrm>
                     <a:prstGeom prst="rect"/>
                   </pic:spPr>
@@ -449,7 +449,7 @@
       <w:r>
         <w:drawing>
           <wp:inline xmlns:a="http://schemas.openxmlformats.org/drawingml/2006/main" xmlns:pic="http://schemas.openxmlformats.org/drawingml/2006/picture">
-            <wp:extent cx="5486400" cy="3375422"/>
+            <wp:extent cx="5486400" cy="7858125"/>
             <wp:docPr id="3" name="Picture 3"/>
             <wp:cNvGraphicFramePr>
               <a:graphicFrameLocks noChangeAspect="1"/>
@@ -470,7 +470,7 @@
                   <pic:spPr>
                     <a:xfrm>
                       <a:off x="0" y="0"/>
-                      <a:ext cx="5486400" cy="3375422"/>
+                      <a:ext cx="5486400" cy="7858125"/>
                     </a:xfrm>
                     <a:prstGeom prst="rect"/>
                   </pic:spPr>
@@ -527,7 +527,7 @@
       <w:r>
         <w:drawing>
           <wp:inline xmlns:a="http://schemas.openxmlformats.org/drawingml/2006/main" xmlns:pic="http://schemas.openxmlformats.org/drawingml/2006/picture">
-            <wp:extent cx="5486400" cy="2689622"/>
+            <wp:extent cx="5486400" cy="10321290"/>
             <wp:docPr id="4" name="Picture 4"/>
             <wp:cNvGraphicFramePr>
               <a:graphicFrameLocks noChangeAspect="1"/>
@@ -548,7 +548,7 @@
                   <pic:spPr>
                     <a:xfrm>
                       <a:off x="0" y="0"/>
-                      <a:ext cx="5486400" cy="2689622"/>
+                      <a:ext cx="5486400" cy="10321290"/>
                     </a:xfrm>
                     <a:prstGeom prst="rect"/>
                   </pic:spPr>
@@ -605,7 +605,7 @@
       <w:r>
         <w:drawing>
           <wp:inline xmlns:a="http://schemas.openxmlformats.org/drawingml/2006/main" xmlns:pic="http://schemas.openxmlformats.org/drawingml/2006/picture">
-            <wp:extent cx="5486400" cy="3284339"/>
+            <wp:extent cx="5486400" cy="2543175"/>
             <wp:docPr id="5" name="Picture 5"/>
             <wp:cNvGraphicFramePr>
               <a:graphicFrameLocks noChangeAspect="1"/>
@@ -626,7 +626,7 @@
                   <pic:spPr>
                     <a:xfrm>
                       <a:off x="0" y="0"/>
-                      <a:ext cx="5486400" cy="3284339"/>
+                      <a:ext cx="5486400" cy="2543175"/>
                     </a:xfrm>
                     <a:prstGeom prst="rect"/>
                   </pic:spPr>
@@ -683,7 +683,7 @@
       <w:r>
         <w:drawing>
           <wp:inline xmlns:a="http://schemas.openxmlformats.org/drawingml/2006/main" xmlns:pic="http://schemas.openxmlformats.org/drawingml/2006/picture">
-            <wp:extent cx="5486400" cy="2266355"/>
+            <wp:extent cx="5486400" cy="2543175"/>
             <wp:docPr id="6" name="Picture 6"/>
             <wp:cNvGraphicFramePr>
               <a:graphicFrameLocks noChangeAspect="1"/>
@@ -704,7 +704,7 @@
                   <pic:spPr>
                     <a:xfrm>
                       <a:off x="0" y="0"/>
-                      <a:ext cx="5486400" cy="2266355"/>
+                      <a:ext cx="5486400" cy="2543175"/>
                     </a:xfrm>
                     <a:prstGeom prst="rect"/>
                   </pic:spPr>

</xml_diff>

<commit_message>
Rename customer analysis screenshot to media_customer_analysis_clean.png to force GitHub cache-bust
</commit_message>
<xml_diff>
--- a/report/Project_Report.docx
+++ b/report/Project_Report.docx
@@ -380,7 +380,7 @@
               <a:graphicData uri="http://schemas.openxmlformats.org/drawingml/2006/picture">
                 <pic:pic>
                   <pic:nvPicPr>
-                    <pic:cNvPr id="0" name="media_customer_analysis.png"/>
+                    <pic:cNvPr id="0" name="media_customer_analysis_clean.png"/>
                     <pic:cNvPicPr/>
                   </pic:nvPicPr>
                   <pic:blipFill>
@@ -414,7 +414,7 @@
           <w:i/>
           <w:sz w:val="19"/>
         </w:rPr>
-        <w:t>Figure: Media Customer Analysis</w:t>
+        <w:t>Figure: Media Customer Analysis Clean</w:t>
       </w:r>
     </w:p>
     <w:p>

</xml_diff>